<commit_message>
MODIFY: Added tha api/ to the /me/ end point and added the product image to the cartitem serializer
</commit_message>
<xml_diff>
--- a/Doc/API Documentation.docx
+++ b/Doc/API Documentation.docx
@@ -634,7 +634,7 @@
           <w:lang w:bidi="ar-EG"/>
         </w:rPr>
         <w:drawing>
-          <wp:anchor distT="0" distB="0" distL="114300" distR="114300" simplePos="0" relativeHeight="251658240" behindDoc="0" locked="0" layoutInCell="1" allowOverlap="1" wp14:anchorId="5DA0C184" wp14:editId="51961D38">
+          <wp:anchor distT="0" distB="0" distL="114300" distR="114300" simplePos="0" relativeHeight="251658240" behindDoc="0" locked="0" layoutInCell="1" allowOverlap="1" wp14:anchorId="5DA0C184" wp14:editId="48A9B77C">
             <wp:simplePos x="0" y="0"/>
             <wp:positionH relativeFrom="margin">
               <wp:align>left</wp:align>
@@ -770,9 +770,269 @@
           <w:lang w:bidi="ar-EG"/>
         </w:rPr>
         <w:lastRenderedPageBreak/>
+        <w:t xml:space="preserve">POST/ </w:t>
+      </w:r>
+      <w:r>
+        <w:rPr>
+          <w:lang w:bidi="ar-EG"/>
+        </w:rPr>
+        <w:t>https://modashopbackend-production.up.railway.app/api/cart/apply_coupon/</w:t>
+      </w:r>
+    </w:p>
+    <w:p>
+      <w:pPr>
+        <w:rPr>
+          <w:lang w:bidi="ar-EG"/>
+        </w:rPr>
+      </w:pPr>
+      <w:r>
+        <w:rPr>
+          <w:lang w:bidi="ar-EG"/>
+        </w:rPr>
+        <w:t xml:space="preserve">Applies Coupon to the cart and returns the price after the coupon </w:t>
+      </w:r>
+    </w:p>
+    <w:p>
+      <w:pPr>
+        <w:rPr>
+          <w:lang w:bidi="ar-EG"/>
+        </w:rPr>
+      </w:pPr>
+      <w:r>
+        <w:rPr>
+          <w:lang w:bidi="ar-EG"/>
+        </w:rPr>
+        <w:drawing>
+          <wp:inline distT="0" distB="0" distL="0" distR="0" wp14:anchorId="0764988E" wp14:editId="181CDBFB">
+            <wp:extent cx="5943600" cy="3385820"/>
+            <wp:effectExtent l="0" t="0" r="0" b="5080"/>
+            <wp:docPr id="1814744112" name="Picture 1"/>
+            <wp:cNvGraphicFramePr>
+              <a:graphicFrameLocks xmlns:a="http://schemas.openxmlformats.org/drawingml/2006/main" noChangeAspect="1"/>
+            </wp:cNvGraphicFramePr>
+            <a:graphic xmlns:a="http://schemas.openxmlformats.org/drawingml/2006/main">
+              <a:graphicData uri="http://schemas.openxmlformats.org/drawingml/2006/picture">
+                <pic:pic xmlns:pic="http://schemas.openxmlformats.org/drawingml/2006/picture">
+                  <pic:nvPicPr>
+                    <pic:cNvPr id="1814744112" name=""/>
+                    <pic:cNvPicPr/>
+                  </pic:nvPicPr>
+                  <pic:blipFill>
+                    <a:blip r:embed="rId17"/>
+                    <a:stretch>
+                      <a:fillRect/>
+                    </a:stretch>
+                  </pic:blipFill>
+                  <pic:spPr>
+                    <a:xfrm>
+                      <a:off x="0" y="0"/>
+                      <a:ext cx="5943600" cy="3385820"/>
+                    </a:xfrm>
+                    <a:prstGeom prst="rect">
+                      <a:avLst/>
+                    </a:prstGeom>
+                  </pic:spPr>
+                </pic:pic>
+              </a:graphicData>
+            </a:graphic>
+          </wp:inline>
+        </w:drawing>
+      </w:r>
+    </w:p>
+    <w:p>
+      <w:pPr>
+        <w:rPr>
+          <w:lang w:bidi="ar-EG"/>
+        </w:rPr>
+      </w:pPr>
+    </w:p>
+    <w:p>
+      <w:pPr>
+        <w:rPr>
+          <w:lang w:bidi="ar-EG"/>
+        </w:rPr>
+      </w:pPr>
+    </w:p>
+    <w:p>
+      <w:pPr>
+        <w:rPr>
+          <w:lang w:bidi="ar-EG"/>
+        </w:rPr>
+      </w:pPr>
+    </w:p>
+    <w:p>
+      <w:pPr>
+        <w:rPr>
+          <w:lang w:bidi="ar-EG"/>
+        </w:rPr>
+      </w:pPr>
+    </w:p>
+    <w:p>
+      <w:pPr>
+        <w:rPr>
+          <w:lang w:bidi="ar-EG"/>
+        </w:rPr>
+      </w:pPr>
+    </w:p>
+    <w:p>
+      <w:pPr>
+        <w:rPr>
+          <w:lang w:bidi="ar-EG"/>
+        </w:rPr>
+      </w:pPr>
+    </w:p>
+    <w:p>
+      <w:pPr>
+        <w:rPr>
+          <w:lang w:bidi="ar-EG"/>
+        </w:rPr>
+      </w:pPr>
+    </w:p>
+    <w:p>
+      <w:pPr>
+        <w:rPr>
+          <w:lang w:bidi="ar-EG"/>
+        </w:rPr>
+      </w:pPr>
+    </w:p>
+    <w:p>
+      <w:pPr>
+        <w:rPr>
+          <w:lang w:bidi="ar-EG"/>
+        </w:rPr>
+      </w:pPr>
+    </w:p>
+    <w:p>
+      <w:pPr>
+        <w:rPr>
+          <w:lang w:bidi="ar-EG"/>
+        </w:rPr>
+      </w:pPr>
+    </w:p>
+    <w:p>
+      <w:pPr>
+        <w:rPr>
+          <w:lang w:bidi="ar-EG"/>
+        </w:rPr>
+      </w:pPr>
+    </w:p>
+    <w:p>
+      <w:pPr>
+        <w:rPr>
+          <w:lang w:bidi="ar-EG"/>
+        </w:rPr>
+      </w:pPr>
+    </w:p>
+    <w:p>
+      <w:pPr>
+        <w:rPr>
+          <w:lang w:bidi="ar-EG"/>
+        </w:rPr>
+      </w:pPr>
+    </w:p>
+    <w:p>
+      <w:pPr>
+        <w:rPr>
+          <w:lang w:bidi="ar-EG"/>
+        </w:rPr>
+      </w:pPr>
+      <w:r>
+        <w:rPr>
+          <w:lang w:bidi="ar-EG"/>
+        </w:rPr>
+        <w:lastRenderedPageBreak/>
+        <w:t xml:space="preserve">POST/ </w:t>
+      </w:r>
+      <w:hyperlink r:id="rId18" w:history="1">
+        <w:r>
+          <w:rPr>
+            <w:rStyle w:val="Hyperlink"/>
+            <w:lang w:bidi="ar-EG"/>
+          </w:rPr>
+          <w:t>https://modashopbackend-production.up.railway.app/api/cart/remove_coupon/</w:t>
+        </w:r>
+      </w:hyperlink>
+    </w:p>
+    <w:p>
+      <w:pPr>
+        <w:rPr>
+          <w:lang w:bidi="ar-EG"/>
+        </w:rPr>
+      </w:pPr>
+      <w:r>
+        <w:rPr>
+          <w:lang w:bidi="ar-EG"/>
+        </w:rPr>
+        <w:t xml:space="preserve">Removes coupon from the cart </w:t>
+      </w:r>
+      <w:r>
+        <w:rPr>
+          <w:lang w:bidi="ar-EG"/>
+        </w:rPr>
+        <w:drawing>
+          <wp:inline distT="0" distB="0" distL="0" distR="0" wp14:anchorId="71CE8752" wp14:editId="6F767514">
+            <wp:extent cx="5943600" cy="3385820"/>
+            <wp:effectExtent l="0" t="0" r="0" b="5080"/>
+            <wp:docPr id="671547859" name="Picture 1"/>
+            <wp:cNvGraphicFramePr>
+              <a:graphicFrameLocks xmlns:a="http://schemas.openxmlformats.org/drawingml/2006/main" noChangeAspect="1"/>
+            </wp:cNvGraphicFramePr>
+            <a:graphic xmlns:a="http://schemas.openxmlformats.org/drawingml/2006/main">
+              <a:graphicData uri="http://schemas.openxmlformats.org/drawingml/2006/picture">
+                <pic:pic xmlns:pic="http://schemas.openxmlformats.org/drawingml/2006/picture">
+                  <pic:nvPicPr>
+                    <pic:cNvPr id="671547859" name=""/>
+                    <pic:cNvPicPr/>
+                  </pic:nvPicPr>
+                  <pic:blipFill>
+                    <a:blip r:embed="rId19"/>
+                    <a:stretch>
+                      <a:fillRect/>
+                    </a:stretch>
+                  </pic:blipFill>
+                  <pic:spPr>
+                    <a:xfrm>
+                      <a:off x="0" y="0"/>
+                      <a:ext cx="5943600" cy="3385820"/>
+                    </a:xfrm>
+                    <a:prstGeom prst="rect">
+                      <a:avLst/>
+                    </a:prstGeom>
+                  </pic:spPr>
+                </pic:pic>
+              </a:graphicData>
+            </a:graphic>
+          </wp:inline>
+        </w:drawing>
+      </w:r>
+    </w:p>
+    <w:p>
+      <w:pPr>
+        <w:rPr>
+          <w:lang w:bidi="ar-EG"/>
+        </w:rPr>
+      </w:pPr>
+    </w:p>
+    <w:p>
+      <w:pPr>
+        <w:rPr>
+          <w:lang w:bidi="ar-EG"/>
+        </w:rPr>
+      </w:pPr>
+    </w:p>
+    <w:p>
+      <w:pPr>
+        <w:rPr>
+          <w:lang w:bidi="ar-EG"/>
+        </w:rPr>
+      </w:pPr>
+      <w:r>
+        <w:rPr>
+          <w:lang w:bidi="ar-EG"/>
+        </w:rPr>
         <w:t xml:space="preserve">7 – POST/  </w:t>
       </w:r>
-      <w:hyperlink r:id="rId17" w:history="1">
+      <w:hyperlink r:id="rId20" w:history="1">
         <w:r>
           <w:rPr>
             <w:rStyle w:val="Hyperlink"/>
@@ -832,6 +1092,7 @@
           <w:noProof/>
           <w:lang w:bidi="ar-EG"/>
         </w:rPr>
+        <w:lastRenderedPageBreak/>
         <w:drawing>
           <wp:inline distT="0" distB="0" distL="0" distR="0" wp14:anchorId="116764E9" wp14:editId="33C99FA1">
             <wp:extent cx="5943600" cy="3378835"/>
@@ -848,7 +1109,7 @@
                     <pic:cNvPicPr/>
                   </pic:nvPicPr>
                   <pic:blipFill>
-                    <a:blip r:embed="rId18"/>
+                    <a:blip r:embed="rId21"/>
                     <a:stretch>
                       <a:fillRect/>
                     </a:stretch>
@@ -888,7 +1149,7 @@
           <w:lang w:bidi="ar-EG"/>
         </w:rPr>
       </w:pPr>
-      <w:hyperlink r:id="rId19" w:history="1">
+      <w:hyperlink r:id="rId22" w:history="1">
         <w:r>
           <w:rPr>
             <w:rStyle w:val="Hyperlink"/>
@@ -915,9 +1176,8 @@
           <w:noProof/>
           <w:lang w:bidi="ar-EG"/>
         </w:rPr>
-        <w:lastRenderedPageBreak/>
         <w:drawing>
-          <wp:anchor distT="0" distB="0" distL="114300" distR="114300" simplePos="0" relativeHeight="251659264" behindDoc="1" locked="0" layoutInCell="1" allowOverlap="1" wp14:anchorId="7A2FD0CA" wp14:editId="40A9EA81">
+          <wp:anchor distT="0" distB="0" distL="114300" distR="114300" simplePos="0" relativeHeight="251659264" behindDoc="1" locked="0" layoutInCell="1" allowOverlap="1" wp14:anchorId="7A2FD0CA" wp14:editId="4A6CBD5F">
             <wp:simplePos x="0" y="0"/>
             <wp:positionH relativeFrom="margin">
               <wp:align>left</wp:align>
@@ -948,7 +1208,7 @@
                     <pic:cNvPicPr/>
                   </pic:nvPicPr>
                   <pic:blipFill>
-                    <a:blip r:embed="rId20" cstate="print">
+                    <a:blip r:embed="rId23" cstate="print">
                       <a:extLst>
                         <a:ext uri="{28A0092B-C50C-407E-A947-70E740481C1C}">
                           <a14:useLocalDpi xmlns:a14="http://schemas.microsoft.com/office/drawing/2010/main" val="0"/>
@@ -1099,6 +1359,7 @@
           <w:noProof/>
           <w:lang w:bidi="ar-EG"/>
         </w:rPr>
+        <w:lastRenderedPageBreak/>
         <w:drawing>
           <wp:inline distT="0" distB="0" distL="0" distR="0" wp14:anchorId="24D9C765" wp14:editId="7DC8CD34">
             <wp:extent cx="5943600" cy="3274060"/>
@@ -1115,7 +1376,7 @@
                     <pic:cNvPicPr/>
                   </pic:nvPicPr>
                   <pic:blipFill>
-                    <a:blip r:embed="rId21"/>
+                    <a:blip r:embed="rId24"/>
                     <a:stretch>
                       <a:fillRect/>
                     </a:stretch>
@@ -1148,7 +1409,7 @@
         </w:rPr>
         <w:t xml:space="preserve">10 – GET / </w:t>
       </w:r>
-      <w:hyperlink r:id="rId22" w:history="1">
+      <w:hyperlink r:id="rId25" w:history="1">
         <w:r>
           <w:rPr>
             <w:rStyle w:val="Hyperlink"/>
@@ -1168,7 +1429,6 @@
         <w:rPr>
           <w:lang w:bidi="ar-EG"/>
         </w:rPr>
-        <w:lastRenderedPageBreak/>
         <w:t>Retrieves user name and email address and previous orders (requires Authentication)</w:t>
       </w:r>
       <w:r>
@@ -1192,7 +1452,7 @@
                     <pic:cNvPicPr/>
                   </pic:nvPicPr>
                   <pic:blipFill>
-                    <a:blip r:embed="rId23"/>
+                    <a:blip r:embed="rId26"/>
                     <a:stretch>
                       <a:fillRect/>
                     </a:stretch>
@@ -1225,7 +1485,7 @@
         </w:rPr>
         <w:t xml:space="preserve">11 – POST/ </w:t>
       </w:r>
-      <w:hyperlink r:id="rId24" w:history="1">
+      <w:hyperlink r:id="rId27" w:history="1">
         <w:r>
           <w:rPr>
             <w:rStyle w:val="Hyperlink"/>
@@ -1272,6 +1532,7 @@
           <w:noProof/>
           <w:lang w:bidi="ar-EG"/>
         </w:rPr>
+        <w:lastRenderedPageBreak/>
         <w:drawing>
           <wp:inline distT="0" distB="0" distL="0" distR="0" wp14:anchorId="63032F89" wp14:editId="5A56F1CB">
             <wp:extent cx="5943600" cy="1815465"/>
@@ -1288,7 +1549,7 @@
                     <pic:cNvPicPr/>
                   </pic:nvPicPr>
                   <pic:blipFill>
-                    <a:blip r:embed="rId25"/>
+                    <a:blip r:embed="rId28"/>
                     <a:stretch>
                       <a:fillRect/>
                     </a:stretch>
@@ -1328,7 +1589,7 @@
         </w:rPr>
         <w:t xml:space="preserve">12 – POST/ </w:t>
       </w:r>
-      <w:hyperlink r:id="rId26" w:history="1">
+      <w:hyperlink r:id="rId29" w:history="1">
         <w:r>
           <w:rPr>
             <w:rStyle w:val="Hyperlink"/>
@@ -1374,7 +1635,6 @@
         <w:rPr>
           <w:noProof/>
         </w:rPr>
-        <w:lastRenderedPageBreak/>
         <w:drawing>
           <wp:inline distT="0" distB="0" distL="0" distR="0" wp14:anchorId="53E5E87C" wp14:editId="39580DC4">
             <wp:extent cx="5943600" cy="3043555"/>
@@ -1391,7 +1651,7 @@
                     <pic:cNvPicPr/>
                   </pic:nvPicPr>
                   <pic:blipFill>
-                    <a:blip r:embed="rId27"/>
+                    <a:blip r:embed="rId30"/>
                     <a:stretch>
                       <a:fillRect/>
                     </a:stretch>
@@ -1445,7 +1705,7 @@
         </w:rPr>
         <w:t xml:space="preserve">13 – POST/ </w:t>
       </w:r>
-      <w:hyperlink r:id="rId28" w:history="1">
+      <w:hyperlink r:id="rId31" w:history="1">
         <w:r>
           <w:rPr>
             <w:rStyle w:val="Hyperlink"/>
@@ -1479,6 +1739,7 @@
           <w:noProof/>
           <w:lang w:bidi="ar-EG"/>
         </w:rPr>
+        <w:lastRenderedPageBreak/>
         <w:drawing>
           <wp:inline distT="0" distB="0" distL="0" distR="0" wp14:anchorId="7693DD36" wp14:editId="5FCD73FB">
             <wp:extent cx="5943600" cy="3080385"/>
@@ -1495,7 +1756,7 @@
                     <pic:cNvPicPr/>
                   </pic:nvPicPr>
                   <pic:blipFill>
-                    <a:blip r:embed="rId29"/>
+                    <a:blip r:embed="rId32"/>
                     <a:stretch>
                       <a:fillRect/>
                     </a:stretch>
@@ -2251,7 +2512,6 @@
   <w:style w:type="character" w:default="1" w:styleId="DefaultParagraphFont">
     <w:name w:val="Default Paragraph Font"/>
     <w:uiPriority w:val="1"/>
-    <w:semiHidden/>
     <w:unhideWhenUsed/>
   </w:style>
   <w:style w:type="table" w:default="1" w:styleId="TableNormal">

</xml_diff>

<commit_message>
MODIFY: edited the message of the response to not include (Cash on Delivery)
</commit_message>
<xml_diff>
--- a/Doc/API Documentation.docx
+++ b/Doc/API Documentation.docx
@@ -16,8 +16,13 @@
       </w:hyperlink>
     </w:p>
     <w:p>
-      <w:r>
-        <w:t>Lists all the products in the database</w:t>
+      <w:proofErr w:type="gramStart"/>
+      <w:r>
+        <w:t>Lists</w:t>
+      </w:r>
+      <w:proofErr w:type="gramEnd"/>
+      <w:r>
+        <w:t xml:space="preserve"> all the products in the database</w:t>
       </w:r>
     </w:p>
     <w:p>
@@ -634,7 +639,7 @@
           <w:lang w:bidi="ar-EG"/>
         </w:rPr>
         <w:drawing>
-          <wp:anchor distT="0" distB="0" distL="114300" distR="114300" simplePos="0" relativeHeight="251658240" behindDoc="0" locked="0" layoutInCell="1" allowOverlap="1" wp14:anchorId="5DA0C184" wp14:editId="48A9B77C">
+          <wp:anchor distT="0" distB="0" distL="114300" distR="114300" simplePos="0" relativeHeight="251658240" behindDoc="0" locked="0" layoutInCell="1" allowOverlap="1" wp14:anchorId="5DA0C184" wp14:editId="09F1CC59">
             <wp:simplePos x="0" y="0"/>
             <wp:positionH relativeFrom="margin">
               <wp:align>left</wp:align>
@@ -800,6 +805,7 @@
       </w:pPr>
       <w:r>
         <w:rPr>
+          <w:noProof/>
           <w:lang w:bidi="ar-EG"/>
         </w:rPr>
         <w:drawing>
@@ -967,6 +973,7 @@
       </w:r>
       <w:r>
         <w:rPr>
+          <w:noProof/>
           <w:lang w:bidi="ar-EG"/>
         </w:rPr>
         <w:drawing>
@@ -1177,7 +1184,7 @@
           <w:lang w:bidi="ar-EG"/>
         </w:rPr>
         <w:drawing>
-          <wp:anchor distT="0" distB="0" distL="114300" distR="114300" simplePos="0" relativeHeight="251659264" behindDoc="1" locked="0" layoutInCell="1" allowOverlap="1" wp14:anchorId="7A2FD0CA" wp14:editId="4A6CBD5F">
+          <wp:anchor distT="0" distB="0" distL="114300" distR="114300" simplePos="0" relativeHeight="251659264" behindDoc="1" locked="0" layoutInCell="1" allowOverlap="1" wp14:anchorId="7A2FD0CA" wp14:editId="6B1E7169">
             <wp:simplePos x="0" y="0"/>
             <wp:positionH relativeFrom="margin">
               <wp:align>left</wp:align>
@@ -1345,7 +1352,21 @@
         <w:rPr>
           <w:lang w:bidi="ar-EG"/>
         </w:rPr>
-        <w:t>Data must be send as follows:</w:t>
+        <w:t xml:space="preserve">Data must be </w:t>
+      </w:r>
+      <w:proofErr w:type="gramStart"/>
+      <w:r>
+        <w:rPr>
+          <w:lang w:bidi="ar-EG"/>
+        </w:rPr>
+        <w:t>send</w:t>
+      </w:r>
+      <w:proofErr w:type="gramEnd"/>
+      <w:r>
+        <w:rPr>
+          <w:lang w:bidi="ar-EG"/>
+        </w:rPr>
+        <w:t xml:space="preserve"> as follows:</w:t>
       </w:r>
     </w:p>
     <w:p>
@@ -1429,7 +1450,21 @@
         <w:rPr>
           <w:lang w:bidi="ar-EG"/>
         </w:rPr>
-        <w:t>Retrieves user name and email address and previous orders (requires Authentication)</w:t>
+        <w:t xml:space="preserve">Retrieves </w:t>
+      </w:r>
+      <w:proofErr w:type="gramStart"/>
+      <w:r>
+        <w:rPr>
+          <w:lang w:bidi="ar-EG"/>
+        </w:rPr>
+        <w:t>user name</w:t>
+      </w:r>
+      <w:proofErr w:type="gramEnd"/>
+      <w:r>
+        <w:rPr>
+          <w:lang w:bidi="ar-EG"/>
+        </w:rPr>
+        <w:t xml:space="preserve"> and email address and previous orders (requires Authentication)</w:t>
       </w:r>
       <w:r>
         <w:rPr>
@@ -1518,7 +1553,21 @@
         <w:rPr>
           <w:lang w:bidi="ar-EG"/>
         </w:rPr>
-        <w:t>*Might return an error with a code 500 because of Railway free restrictions</w:t>
+        <w:t xml:space="preserve">*Might </w:t>
+      </w:r>
+      <w:proofErr w:type="gramStart"/>
+      <w:r>
+        <w:rPr>
+          <w:lang w:bidi="ar-EG"/>
+        </w:rPr>
+        <w:t>return</w:t>
+      </w:r>
+      <w:proofErr w:type="gramEnd"/>
+      <w:r>
+        <w:rPr>
+          <w:lang w:bidi="ar-EG"/>
+        </w:rPr>
+        <w:t xml:space="preserve"> an error with a code 500 because of Railway free restrictions</w:t>
       </w:r>
     </w:p>
     <w:p>
@@ -1765,6 +1814,255 @@
                     <a:xfrm>
                       <a:off x="0" y="0"/>
                       <a:ext cx="5943600" cy="3080385"/>
+                    </a:xfrm>
+                    <a:prstGeom prst="rect">
+                      <a:avLst/>
+                    </a:prstGeom>
+                  </pic:spPr>
+                </pic:pic>
+              </a:graphicData>
+            </a:graphic>
+          </wp:inline>
+        </w:drawing>
+      </w:r>
+    </w:p>
+    <w:p>
+      <w:pPr>
+        <w:rPr>
+          <w:lang w:bidi="ar-EG"/>
+        </w:rPr>
+      </w:pPr>
+    </w:p>
+    <w:p>
+      <w:pPr>
+        <w:rPr>
+          <w:lang w:bidi="ar-EG"/>
+        </w:rPr>
+      </w:pPr>
+      <w:r>
+        <w:rPr>
+          <w:lang w:bidi="ar-EG"/>
+        </w:rPr>
+        <w:t xml:space="preserve">GET/ </w:t>
+      </w:r>
+    </w:p>
+    <w:p>
+      <w:pPr>
+        <w:rPr>
+          <w:lang w:bidi="ar-EG"/>
+        </w:rPr>
+      </w:pPr>
+      <w:hyperlink r:id="rId33" w:history="1">
+        <w:r>
+          <w:rPr>
+            <w:rStyle w:val="Hyperlink"/>
+            <w:lang w:bidi="ar-EG"/>
+          </w:rPr>
+          <w:t>https://modashopbackend</w:t>
+        </w:r>
+        <w:r>
+          <w:rPr>
+            <w:rStyle w:val="Hyperlink"/>
+            <w:lang w:bidi="ar-EG"/>
+          </w:rPr>
+          <w:t>-</w:t>
+        </w:r>
+        <w:r>
+          <w:rPr>
+            <w:rStyle w:val="Hyperlink"/>
+            <w:lang w:bidi="ar-EG"/>
+          </w:rPr>
+          <w:t>production.up.railway.app/api/orders/order_details/</w:t>
+        </w:r>
+        <w:r>
+          <w:rPr>
+            <w:rStyle w:val="Hyperlink"/>
+            <w:lang w:bidi="ar-EG"/>
+          </w:rPr>
+          <w:t>&lt;order_id&gt;</w:t>
+        </w:r>
+        <w:r>
+          <w:rPr>
+            <w:rStyle w:val="Hyperlink"/>
+            <w:lang w:bidi="ar-EG"/>
+          </w:rPr>
+          <w:t>/</w:t>
+        </w:r>
+      </w:hyperlink>
+    </w:p>
+    <w:p>
+      <w:pPr>
+        <w:rPr>
+          <w:lang w:bidi="ar-EG"/>
+        </w:rPr>
+      </w:pPr>
+      <w:proofErr w:type="spellStart"/>
+      <w:r>
+        <w:rPr>
+          <w:lang w:bidi="ar-EG"/>
+        </w:rPr>
+        <w:t>Retrives</w:t>
+      </w:r>
+      <w:proofErr w:type="spellEnd"/>
+      <w:r>
+        <w:rPr>
+          <w:lang w:bidi="ar-EG"/>
+        </w:rPr>
+        <w:t xml:space="preserve"> order details with the order id </w:t>
+      </w:r>
+    </w:p>
+    <w:p>
+      <w:pPr>
+        <w:rPr>
+          <w:lang w:bidi="ar-EG"/>
+        </w:rPr>
+      </w:pPr>
+      <w:r>
+        <w:rPr>
+          <w:lang w:bidi="ar-EG"/>
+        </w:rPr>
+        <w:t>Requires Authentication</w:t>
+      </w:r>
+    </w:p>
+    <w:p>
+      <w:pPr>
+        <w:rPr>
+          <w:lang w:bidi="ar-EG"/>
+        </w:rPr>
+      </w:pPr>
+      <w:r>
+        <w:rPr>
+          <w:lang w:bidi="ar-EG"/>
+        </w:rPr>
+        <w:drawing>
+          <wp:inline distT="0" distB="0" distL="0" distR="0" wp14:anchorId="1F6472C7" wp14:editId="47D9DD84">
+            <wp:extent cx="5151120" cy="2940431"/>
+            <wp:effectExtent l="0" t="0" r="0" b="0"/>
+            <wp:docPr id="1968690290" name="Picture 1"/>
+            <wp:cNvGraphicFramePr>
+              <a:graphicFrameLocks xmlns:a="http://schemas.openxmlformats.org/drawingml/2006/main" noChangeAspect="1"/>
+            </wp:cNvGraphicFramePr>
+            <a:graphic xmlns:a="http://schemas.openxmlformats.org/drawingml/2006/main">
+              <a:graphicData uri="http://schemas.openxmlformats.org/drawingml/2006/picture">
+                <pic:pic xmlns:pic="http://schemas.openxmlformats.org/drawingml/2006/picture">
+                  <pic:nvPicPr>
+                    <pic:cNvPr id="1968690290" name=""/>
+                    <pic:cNvPicPr/>
+                  </pic:nvPicPr>
+                  <pic:blipFill>
+                    <a:blip r:embed="rId34"/>
+                    <a:stretch>
+                      <a:fillRect/>
+                    </a:stretch>
+                  </pic:blipFill>
+                  <pic:spPr>
+                    <a:xfrm>
+                      <a:off x="0" y="0"/>
+                      <a:ext cx="5157641" cy="2944153"/>
+                    </a:xfrm>
+                    <a:prstGeom prst="rect">
+                      <a:avLst/>
+                    </a:prstGeom>
+                  </pic:spPr>
+                </pic:pic>
+              </a:graphicData>
+            </a:graphic>
+          </wp:inline>
+        </w:drawing>
+      </w:r>
+    </w:p>
+    <w:p>
+      <w:pPr>
+        <w:rPr>
+          <w:lang w:bidi="ar-EG"/>
+        </w:rPr>
+      </w:pPr>
+      <w:r>
+        <w:rPr>
+          <w:lang w:bidi="ar-EG"/>
+        </w:rPr>
+        <w:lastRenderedPageBreak/>
+        <w:t xml:space="preserve">GET/ </w:t>
+      </w:r>
+      <w:hyperlink r:id="rId35" w:history="1">
+        <w:r>
+          <w:rPr>
+            <w:rStyle w:val="Hyperlink"/>
+            <w:lang w:bidi="ar-EG"/>
+          </w:rPr>
+          <w:t>https://modashopbackend-production.up.railway.app/api/orders/user_orders/</w:t>
+        </w:r>
+      </w:hyperlink>
+    </w:p>
+    <w:p>
+      <w:pPr>
+        <w:rPr>
+          <w:lang w:bidi="ar-EG"/>
+        </w:rPr>
+      </w:pPr>
+      <w:r>
+        <w:rPr>
+          <w:lang w:bidi="ar-EG"/>
+        </w:rPr>
+        <w:t xml:space="preserve">Retrieves all user orders </w:t>
+      </w:r>
+    </w:p>
+    <w:p>
+      <w:pPr>
+        <w:rPr>
+          <w:lang w:bidi="ar-EG"/>
+        </w:rPr>
+      </w:pPr>
+      <w:r>
+        <w:rPr>
+          <w:lang w:bidi="ar-EG"/>
+        </w:rPr>
+        <w:t xml:space="preserve">Requires </w:t>
+      </w:r>
+      <w:proofErr w:type="spellStart"/>
+      <w:r>
+        <w:rPr>
+          <w:lang w:bidi="ar-EG"/>
+        </w:rPr>
+        <w:t>Authentciation</w:t>
+      </w:r>
+      <w:proofErr w:type="spellEnd"/>
+    </w:p>
+    <w:p>
+      <w:pPr>
+        <w:rPr>
+          <w:lang w:bidi="ar-EG"/>
+        </w:rPr>
+      </w:pPr>
+      <w:r>
+        <w:rPr>
+          <w:lang w:bidi="ar-EG"/>
+        </w:rPr>
+        <w:drawing>
+          <wp:inline distT="0" distB="0" distL="0" distR="0" wp14:anchorId="519EC5CA" wp14:editId="1C6459CC">
+            <wp:extent cx="5943600" cy="3166745"/>
+            <wp:effectExtent l="0" t="0" r="0" b="0"/>
+            <wp:docPr id="870733374" name="Picture 1"/>
+            <wp:cNvGraphicFramePr>
+              <a:graphicFrameLocks xmlns:a="http://schemas.openxmlformats.org/drawingml/2006/main" noChangeAspect="1"/>
+            </wp:cNvGraphicFramePr>
+            <a:graphic xmlns:a="http://schemas.openxmlformats.org/drawingml/2006/main">
+              <a:graphicData uri="http://schemas.openxmlformats.org/drawingml/2006/picture">
+                <pic:pic xmlns:pic="http://schemas.openxmlformats.org/drawingml/2006/picture">
+                  <pic:nvPicPr>
+                    <pic:cNvPr id="870733374" name=""/>
+                    <pic:cNvPicPr/>
+                  </pic:nvPicPr>
+                  <pic:blipFill>
+                    <a:blip r:embed="rId36"/>
+                    <a:stretch>
+                      <a:fillRect/>
+                    </a:stretch>
+                  </pic:blipFill>
+                  <pic:spPr>
+                    <a:xfrm>
+                      <a:off x="0" y="0"/>
+                      <a:ext cx="5943600" cy="3166745"/>
                     </a:xfrm>
                     <a:prstGeom prst="rect">
                       <a:avLst/>

</xml_diff>